<commit_message>
Update brief: less prescriptive reference architecture
Co-Authored-By: Claude Opus 5.5 (1M context) <noreply@anthropic.com>
</commit_message>
<xml_diff>
--- a/Ambit_Implementation_Case_Study_Candidate_Brief.docx
+++ b/Ambit_Implementation_Case_Study_Candidate_Brief.docx
@@ -1843,7 +1843,7 @@
               <w:spacing w:after="40" w:before="0"/>
             </w:pPr>
             <w:r>
-              <w:t xml:space="preserve">Convert 10-digit NDCs to the 11-digit billing format and split out dosage form, route, and strength so billing rules can match on them.</w:t>
+              <w:t xml:space="preserve">Standardize code formats and split out dosage form, route, and strength so billing rules can match on them.</w:t>
             </w:r>
           </w:p>
         </w:tc>
@@ -2268,7 +2268,7 @@
               <w:spacing w:after="40" w:before="0"/>
             </w:pPr>
             <w:r>
-              <w:t xml:space="preserve">Small typed functions under a read-only identity. The agent, the pipeline, and the eval suite use the same tools, and every call is traced. The function names are illustrative; design your own.</w:t>
+              <w:t xml:space="preserve">Small typed functions under a read-only identity, shared by the agent, the pipeline, and the eval suite, with every call traced. The diagram shows one example; which tools you need, and what they take and return, is part of your design.</w:t>
             </w:r>
           </w:p>
         </w:tc>
@@ -2523,7 +2523,7 @@
               <w:spacing w:after="40" w:before="0"/>
             </w:pPr>
             <w:r>
-              <w:t xml:space="preserve">Representative business scenarios run against the real tools before every release. It scores the codes produced, not how the answer reads.</w:t>
+              <w:t xml:space="preserve">Business scenarios you define, run against the real tools before every release.</w:t>
             </w:r>
           </w:p>
         </w:tc>

</xml_diff>